<commit_message>
fix: support mixed DAILY expense application items
</commit_message>
<xml_diff>
--- a/docs/01-项目需求规格说明书_V3.0.docx
+++ b/docs/01-项目需求规格说明书_V3.0.docx
@@ -204,7 +204,7 @@
         <w:pStyle w:val="ListBullet"/>
       </w:pPr>
       <w:r>
-        <w:t>费用申请首先确定不可变 applicationScope：DAILY 或 TASK。DAILY 可单笔或系统固定 Excel 批次；TASK 只可单笔，先选司机再从其参与任务中选目标。司机与公司车分别真实存在，DAILY 不要求两者当前绑定。外协司机不得申请费用。费用种类不硬编码限定范围；统一字段为日期、公司车、司机、明细、金额、票据号、发票号、备注和站点名称，金额必须大于 0，其余描述字段可空，不设置“是否结清”。</w:t>
+        <w:t>费用申请首先确定不可变 applicationScope：DAILY 或 TASK。DAILY 在同一申请中维护可编辑明细表，支持手工新增多条及导入系统固定 Excel 行后统一修改、删除；Excel 仅辅助填表，最终以提交时确认的明细为准；TASK 只可单笔，先选司机再从其参与任务中选目标。司机与公司车分别真实存在，DAILY 不要求两者当前绑定。外协司机不得申请费用。费用种类不硬编码限定范围；统一字段为日期、公司车、司机、明细、金额、票据号、发票号、备注和站点名称，金额必须大于 0，其余描述字段可空，不设置“是否结清”。</w:t>
       </w:r>
     </w:p>
     <w:p>
@@ -212,7 +212,7 @@
         <w:pStyle w:val="ListBullet"/>
       </w:pPr>
       <w:r>
-        <w:t>DAILY Excel 一批同一费用大类、N 条明细、一个审批实例；任一行格式或金额错误阻止正式提交。整批通过或打回。批准时以审批实例+明细稳定键幂等生成恰好 N 条 ExpenseEntry；GENERAL 不产生费用，TIRE_REPLACEMENT 按轮胎业务规则生效。</w:t>
+        <w:t>DAILY 一次申请限定同一费用大类，手工与 Excel 导入明细共同构成最终 N 条，创建一个审批实例；Excel 预览不创建审批或费用，最终提交时服务端逐条重验，任一明细错误阻止提交。整批通过或打回。批准时以审批实例+明细稳定键幂等生成恰好 N 条 ExpenseEntry；GENERAL 不产生费用，TIRE_REPLACEMENT 按轮胎业务规则生效。</w:t>
       </w:r>
     </w:p>
     <w:p>

</xml_diff>

<commit_message>
chore: establish V3.0 pre-acceptance baseline
</commit_message>
<xml_diff>
--- a/docs/01-项目需求规格说明书_V3.0.docx
+++ b/docs/01-项目需求规格说明书_V3.0.docx
@@ -36,8 +36,9 @@
         <w:pStyle w:val="ListBullet"/>
       </w:pPr>
       <w:r>
-        <w:t>Driver.driverType 是 INTERNAL 或 OUTSOURCED 的唯一权威，不能由客户端传入的类型、角色或有无绑定推断。后台创建司机时，若手机号无合法 DRIVER User，由创建人填写初始密码并创建安全哈希账号；若已有合法 DRIVER User，直接关联且不改密码。密码不明文返回、不写日志或 Audit，重置走正式重置流程。</w:t>
+        <w:t>Driver.driverType 是 INTERNAL 或 OUTSOURCED 的唯一权威，不能由客户端传入的类型、角色或有无绑定推断。后台创建司机时，若手机号无合法 DRIVER User，由创建人填写不少于 6 位的初始密码并创建安全哈希账号；若已有合法 DRIVER User，直接关联且不改密码。密码不明文返回、不写日志或 Audit，重置走正式重置流程。司机姓名、手机号、司机类型、身份证号、驾驶证号均为必填。身份证号与驾驶证号分别录入、分别全局唯一；大陆18位身份证必须通过格式、出生日期和校验码检查。出生日期仅由合法身份证号派生，年龄按当前日期计算实际周岁，两者只读且年龄不持久化。驾驶证号只去除首尾空格，不附加号码格式限制。</w:t>
       </w:r>
+      <w:r/>
     </w:p>
     <w:p>
       <w:pPr>
@@ -45,6 +46,9 @@
       </w:pPr>
       <w:r>
         <w:t>INTERNAL 司机可按正式规则绑定公司车辆；公司车可绑定车挂。绑定、解绑保留时间、操作者和原因。运输中的公司车/司机/车挂快照受锁保护，不能通过变更绑定改写运输事实。</w:t>
+      </w:r>
+      <w:r>
+        <w:t>公司车辆的行驶证号由车辆资料独立录入，必填、去除首尾空格且全局唯一；不得放入司机资料。</w:t>
       </w:r>
     </w:p>
     <w:p>
@@ -54,13 +58,16 @@
       <w:r>
         <w:t>OUTSOURCED 不绑定、不查询、不创建公司 Vehicle；每次任务逐条填写真实外协车牌。其小程序只开放本人核心运输操作，不开放费用申请、换胎、工资或公司经营数据。</w:t>
       </w:r>
+      <w:r>
+        <w:t>管理端司机列表及详情中的外协司机当前公司车辆显示“不适用”，不提供绑定、换绑或解绑公司车入口，服务端同样拒绝。</w:t>
+      </w:r>
     </w:p>
     <w:p>
       <w:pPr>
         <w:pStyle w:val="ListBullet"/>
       </w:pPr>
       <w:r>
-        <w:t>Product 是唯一货物主数据；客户直接使用中文名称，无 Customer 主数据依赖。司机、车辆、车挂、货物的停用与历史关系不得破坏既有任务快照。</w:t>
+        <w:t>Product 是唯一货物主数据；客户直接使用中文名称，无 Customer 主数据依赖。司机、车辆、车挂、货物的停用与历史关系不得破坏既有任务快照。 司机存在当前负责的 PUBLISHED、IN_TRANSIT 或 TRANSFER_PENDING 运输任务时不得禁用；调度草稿、已完成和已取消任务不阻断。禁用不解绑、不改写历史或任务事实；禁用后所有登录入口及既有令牌均不得继续执行司机业务，重新启用后仍须重新满足分配及绑定条件。</w:t>
       </w:r>
     </w:p>
     <w:p>
@@ -196,8 +203,10 @@
         <w:pStyle w:val="ListBullet"/>
       </w:pPr>
       <w:r>
-        <w:t>审批模板业务类型固定为 EXPENSE、GENERAL、TIRE_REPLACEMENT。流程版本发布后不可原地改写；维护时不得新发起，有在途实例时不得修改其定义。实例冻结所用流程版本。指定步骤打回只能从后端返回的当前实例已实际经过且合法的前置步骤中选择稳定 FlowNode ID；禁止手填顺序。打回后目标及后续步骤重新审批，旧结果不得复用；提交修改形成新的 Submission Version。</w:t>
+        <w:t>审批模板业务类型保留 EXPENSE、GENERAL、TIRE_REPLACEMENT；当前业务仅允许新建 EXPENSE 与 TIRE_REPLACEMENT 模板。GENERAL 只用于已有历史或内部审批事实的读取，不提供新建模板 API 或业务发起页面。流程版本发布后不可原地改写；维护时不得新发起，有在途实例时不得修改其定义。实例冻结所用流程版本。指定步骤打回只能从后端返回的当前实例已实际经过且合法的前置步骤中选择稳定 FlowNode ID；禁止手填顺序。打回后目标及后续步骤重新审批，旧结果不得复用；提交修改形成新的 Submission Version。 每个审批步骤必选审批角色，可选指定该角色下的一名审批人；未指定时角色内当前有效且有动作权限的用户均可处理，指定时仅该人员可处理。一人处理成功即完成节点。指定人员停用、移出角色或失去权限时节点继续待处理，不自动放开或改派。申请人可撤回未终态且尚未生效的申请，原实例、版本、动作与撤回事实留存；重新申请创建新实例并使用当时有效模板，已生效费用只能正式冲销。 新建模板的业务名称由服务端按业务类型自动生成：换胎为“换胎申请”，费用按当前有效正式费用大类名称生成；稳定业务编号也由服务端生成。同一业务类型与费用大类不得并存互相冲突的有效模板。 换胎申请由小程序持 BUTTON_MINI_TIRE_REQUEST_SUBMIT 权限的合格自有司机发起；换胎审批与其他审批统一使用 BUTTON_APPROVALS_TODO_APPROVE 通过、BUTTON_APPROVALS_TODO_RETURN 打回，不设轮胎专属审批权限。审批人仍须符合冻结流程节点角色及可选指定人员限制，管理员无绕过资格。</w:t>
       </w:r>
+      <w:r/>
+      <w:r/>
     </w:p>
     <w:p>
       <w:pPr>
@@ -228,7 +237,7 @@
         <w:pStyle w:val="ListBullet"/>
       </w:pPr>
       <w:r>
-        <w:t>普通费用 Excel 不自动匹配任务。充电公司专项导入由管理员维护每家公司唯一当前字段映射，只从系统识别的 Excel 表头列位置选择订单号、车牌、充电时间和金额。前端解析第一工作表，只读预览全部有效订单、异常行、零元数及金额；空行后的订单不得遗漏，汇总行不得入账。操作人员确认前不保存原文件、不生成费用。服务端按原文件复核订单、来源、金额、去重与车辆，保存 ImportBatch、OriginalFile 和 SourceOrder；来源系统＋订单编号类型＋原始订单号唯一。正金额订单生成一条 ExpenseEntry，零元合法订单保留 SourceOrder 及文件行号、参与去重但不入账；金额为空、负数或不可解析阻止提交。有效订单数＝正常入账＋零元不入账＋已存在重复，异常另报。唯一匹配公司车、真实充电时间及实际发车/卸货参与事实时自动归任务；无匹配或多匹配保留未归属，不根据当前绑定、业务日、金额或司机姓名猜测。充电费用仍使用统一 ExpenseEntry 经营与月结口径。</w:t>
+        <w:t>普通 DAILY 费用 Excel 仅用于审批申请填表，TASK 费用只可单笔审批；不提供通用 EXPENSE 直接导入。当前只有充电公司专项可在人工确认并经服务端复核后直接生成 ExpenseEntry。未来其它第三方费用来源须另行确认正式业务规则，不因存在 Excel 或导入菜单自行开放。充电公司专项导入由管理员维护每家公司唯一当前字段映射，只从系统识别的 Excel 表头列位置选择订单号、车牌、充电时间和金额。前端解析第一工作表，只读预览全部有效订单、异常行、零元数及金额；空行后的订单不得遗漏，汇总行不得入账。操作人员确认前不保存原文件、不生成费用。服务端按原文件复核订单、来源、金额、去重与车辆，保存 ImportBatch、OriginalFile 和 SourceOrder；来源系统＋订单编号类型＋原始订单号唯一。正金额订单生成一条 ExpenseEntry，零元合法订单保留 SourceOrder 及文件行号、参与去重但不入账；金额为空、负数或不可解析阻止提交。有效订单数＝正常入账＋零元不入账＋已存在重复，异常另报。唯一匹配公司车、真实充电时间及实际发车/卸货参与事实时自动归任务；无匹配或多匹配保留未归属，不根据当前绑定、业务日、金额或司机姓名猜测。充电费用仍使用统一 ExpenseEntry 经营与月结口径。</w:t>
       </w:r>
     </w:p>
     <w:p>
@@ -316,7 +325,10 @@
         <w:pStyle w:val="ListBullet"/>
       </w:pPr>
       <w:r>
-        <w:t>服务端独立执行身份、权限、本人/参与范围、状态、唯一性、并发和附件权限校验。前端按钮隐藏只是体验。关键写入使用事务、幂等键或乐观版本、数据库唯一约束和 Audit；运输、审批、费用、轮胎、结算历史不可物理破坏。金额与重量使用 DECIMAL。</w:t>
+        <w:t>服务端以唯一功能注册表执行“八域导航—页面—按钮操作”授权。页面权限只允许进入页面并读取必要业务数据，写入必须具备对应按钮操作权限；同一 API 可按安全数据范围关联多个页面或按钮，未注册的受保护 API 默认拒绝。身份、当前有效角色、本人和参与范围、审批节点资格、状态、并发、幂等、附件 Purpose 等业务强校验继续独立执行。权限定义与 API 功能映射在启动时加载，角色授权变更及账号、司机停用必须及时使会话或权限缓存失效，不得沿用撤销前授权。关键业务写入使用事务、数据库约束和 Audit；金额、重量使用 DECIMAL。</w:t>
+      </w:r>
+      <w:r>
+        <w:t xml:space="preserve"> 登录会话仅在 MySQL 保存令牌摘要及用户、终端、签发、到期和撤销事实；管理端有效期 7 天，小程序有效期 30 天。正常重启可恢复未过期且未撤销的会话。角色授权提交后重载权限而不要求重新登录；停用账号、司机或角色以及修改、重置密码时必须撤销相关会话。</w:t>
       </w:r>
     </w:p>
     <w:p>

</xml_diff>

<commit_message>
fix: group mini-program permissions and reject reused driver accounts
</commit_message>
<xml_diff>
--- a/docs/01-项目需求规格说明书_V3.0.docx
+++ b/docs/01-项目需求规格说明书_V3.0.docx
@@ -28,7 +28,7 @@
         <w:pStyle w:val="ListBullet"/>
       </w:pPr>
       <w:r>
-        <w:t>一个 User 只能拥有一个角色；角色关联权限。DRIVER 角色账号仅通过司机业务流程创建或关联，系统用户页不得直接创建或分配 DRIVER。</w:t>
+        <w:t>一个 User 只能拥有一个角色；角色关联权限。DRIVER 角色账号仅通过司机业务流程创建，系统用户页不得直接创建或分配 DRIVER。</w:t>
       </w:r>
     </w:p>
     <w:p>
@@ -36,7 +36,7 @@
         <w:pStyle w:val="ListBullet"/>
       </w:pPr>
       <w:r>
-        <w:t>Driver.driverType 是 INTERNAL 或 OUTSOURCED 的唯一权威，不能由客户端传入的类型、角色或有无绑定推断。后台创建司机时，若手机号无合法 DRIVER User，由创建人填写不少于 6 位的初始密码并创建安全哈希账号；若已有合法 DRIVER User，直接关联且不改密码。密码不明文返回、不写日志或 Audit，重置走正式重置流程。司机姓名、手机号、司机类型、身份证号、驾驶证号均为必填。身份证号与驾驶证号分别录入、分别全局唯一；大陆18位身份证必须通过格式、出生日期和校验码检查。出生日期仅由合法身份证号派生，年龄按当前日期计算实际周岁，两者只读且年龄不持久化。驾驶证号只去除首尾空格，不附加号码格式限制。</w:t>
+        <w:t>Driver.driverType 是 INTERNAL 或 OUTSOURCED 的唯一权威，不能由客户端传入的类型、角色或有无绑定推断。后台创建司机时，由创建人填写不少于 6 位的初始密码，在同一事务中创建司机和安全哈希 DRIVER 账号；手机号已存在任何 User 时拒绝创建，不关联旧账号。密码不明文返回、不写日志或 Audit，重置走正式重置流程。司机姓名、手机号、司机类型、身份证号、驾驶证号均为必填。身份证号与驾驶证号分别录入、分别全局唯一；大陆18位身份证必须通过格式、出生日期和校验码检查。出生日期仅由合法身份证号派生，年龄按当前日期计算实际周岁，两者只读且年龄不持久化。驾驶证号只去除首尾空格，不附加号码格式限制。</w:t>
       </w:r>
       <w:r/>
     </w:p>

</xml_diff>

<commit_message>
feat: refine V3 fleet workflows and admin UI
</commit_message>
<xml_diff>
--- a/docs/01-项目需求规格说明书_V3.0.docx
+++ b/docs/01-项目需求规格说明书_V3.0.docx
@@ -14,6 +14,7 @@
       <w:r>
         <w:t>本说明书定义首次正式上线的业务行为。系统由 Vue 管理端、微信小程序和 Java 服务组成；线路模板用于复用业务默认值，运输任务记录每一趟实际运输，参与人记录司机及工资事实。所有金额、权限、状态和历史以服务端正式数据为准。</w:t>
       </w:r>
+      <w:r/>
     </w:p>
     <w:p>
       <w:pPr>
@@ -50,6 +51,17 @@
       <w:r>
         <w:t>公司车辆的行驶证号由车辆资料独立录入，必填、去除首尾空格且全局唯一；不得放入司机资料。</w:t>
       </w:r>
+      <w:r>
+        <w:t xml:space="preserve"> 停用公司车辆前必须确认该车及当前绑定车挂均无待发车或在途任务；允许停用时同一事务解除司机和车挂的当前绑定并保留解绑历史。停用车挂前必须确认其无待发车或在途任务；允许停用时同一事务解除与车辆的当前绑定并留史。停用的车辆或车挂不得建立新绑定。</w:t>
+      </w:r>
+    </w:p>
+    <w:p>
+      <w:pPr>
+        <w:pStyle w:val="ListBullet"/>
+      </w:pPr>
+      <w:r>
+        <w:t>自有司机和公司车辆初始导入仅接受系统固定十列模板：车牌号、驾驶员姓名、电话、行车证号、驾驶证号、身份证号、车辆保险状态(是否齐全)、最大载重（吨）、达标吨数（吨）、能源类型。导入固定 INTERNAL、自有公司车、FIXED 达标、三方启用及初始密码 123456（只存安全哈希）；只创建此前均未录入的司机、账号和车辆，并在同一事务中建立当前绑定及绑定历史。预览不写业务事实，全部行通过后确认时仍重验；任何错误整批拒绝并允许修正后重传，不设独立导入历史。</w:t>
+      </w:r>
     </w:p>
     <w:p>
       <w:pPr>
@@ -67,7 +79,7 @@
         <w:pStyle w:val="ListBullet"/>
       </w:pPr>
       <w:r>
-        <w:t>Product 是唯一货物主数据；客户直接使用中文名称，无 Customer 主数据依赖。司机、车辆、车挂、货物的停用与历史关系不得破坏既有任务快照。 司机存在当前负责的 PUBLISHED、IN_TRANSIT 或 TRANSFER_PENDING 运输任务时不得禁用；调度草稿、已完成和已取消任务不阻断。禁用不解绑、不改写历史或任务事实；禁用后所有登录入口及既有令牌均不得继续执行司机业务，重新启用后仍须重新满足分配及绑定条件。</w:t>
+        <w:t>Product 是唯一货物主数据；客户直接使用中文名称，无 Customer 主数据依赖。司机、车辆、车挂、货物的停用与历史关系不得破坏既有任务快照。 司机存在当前负责的 PUBLISHED、IN_TRANSIT 或 TRANSFER_PENDING 运输任务时不得禁用；调度草稿、已完成和已取消任务不阻断。禁用时解除当前车辆绑定并记录解绑历史，不改写既有任务事实；禁用后所有登录入口及既有令牌均不得继续执行司机业务，重新启用后仍须重新满足分配及绑定条件。</w:t>
       </w:r>
     </w:p>
     <w:p>

</xml_diff>

<commit_message>
feat: consolidate V3 fleet workflow and UI updates
</commit_message>
<xml_diff>
--- a/docs/01-项目需求规格说明书_V3.0.docx
+++ b/docs/01-项目需求规格说明书_V3.0.docx
@@ -54,6 +54,9 @@
       <w:r>
         <w:t xml:space="preserve"> 停用公司车辆前必须确认该车及当前绑定车挂均无待发车或在途任务；允许停用时同一事务解除司机和车挂的当前绑定并保留解绑历史。停用车挂前必须确认其无待发车或在途任务；允许停用时同一事务解除与车辆的当前绑定并留史。停用的车辆或车挂不得建立新绑定。</w:t>
       </w:r>
+      <w:r>
+        <w:t xml:space="preserve"> 当前司机仍有待发车任务时，禁止解除其公司车辆绑定；须先由调度处理该任务。发车继续按当时绑定重新校验车辆资格。</w:t>
+      </w:r>
     </w:p>
     <w:p>
       <w:pPr>
@@ -95,7 +98,10 @@
         <w:pStyle w:val="ListBullet"/>
       </w:pPr>
       <w:r>
-        <w:t>RouteTemplate 为少量人工维护的线路业务模板，保存稳定编号、名称、中文客户名称、Product、装货地、卸货地、默认含税单价（元/吨）、默认信息费（元/趟）、默认司机趟次工资、启停与备注。模板无发车、卸货或完成状态；停用后不得生成新任务。模板修改不回写既有任务。</w:t>
+        <w:t>RouteTemplate 为少量人工维护的线路业务模板，保存由服务端自动生成且不可修改的稳定编号（L 加 7 位数字，共 8 位）、名称、中文客户名称、Product、装货地、卸货地、默认含税单价（元/吨）、默认信息费（元/趟）、默认司机趟次工资、启停与备注。模板无发车、卸货或完成状态；停用后不得生成新任务。模板修改不回写既有任务。</w:t>
+      </w:r>
+      <w:r>
+        <w:t xml:space="preserve"> 创建与修改时，客户中文名称、货物、装货地、卸货地、默认含税单价、默认信息费、默认司机工资七项完全相同的线路模板不得重复保存；名称、编号、启停状态和备注不参与业务重复判断。</w:t>
       </w:r>
     </w:p>
     <w:p>
@@ -119,7 +125,7 @@
         <w:pStyle w:val="ListBullet"/>
       </w:pPr>
       <w:r>
-        <w:t>任务状态为 UNPUBLISHED、PUBLISHED、IN_TRANSIT、TRANSFER_PENDING、COMPLETED、CANCELLED。调度批次发布形成 PUBLISHED；当前司机发车形成 IN_TRANSIT；转派形成 TRANSFER_PENDING；接手发车重新进入 IN_TRANSIT；当前司机卸货形成 COMPLETED。仅从未实际发车且未进入转派执行链的 UNPUBLISHED/PUBLISHED 任务可取消至终态 CANCELLED，取消原因和历史保留、未执行参与工资不计入经营。一旦实际发车，或进入转派执行链，任务不得取消；COMPLETED 永久保留，不存在整任务作废或恢复动作。</w:t>
+        <w:t>任务状态为 PUBLISHED、IN_TRANSIT、TRANSFER_PENDING、COMPLETED、CANCELLED。调度批次发布形成 PUBLISHED；当前司机发车形成 IN_TRANSIT；转派形成 TRANSFER_PENDING；接手发车重新进入 IN_TRANSIT；当前司机卸货形成 COMPLETED。仅从未实际发车且未进入转派执行链的 PUBLISHED 任务可取消至终态 CANCELLED，取消原因和历史保留、未执行参与工资不计入经营。一旦实际发车，或进入转派执行链，任务不得取消；COMPLETED 永久保留，不存在整任务作废或恢复动作。</w:t>
       </w:r>
     </w:p>
     <w:p>
@@ -191,7 +197,7 @@
         <w:pStyle w:val="ListBullet"/>
       </w:pPr>
       <w:r>
-        <w:t>工资台账覆盖 INTERNAL 和 OUTSOURCED，按月、司机、类型、模板、任务及普通/转派筛选；转派任务明显标记并展示所有参与顺序和工资。授权人员在任务上下文批量核定全部参与人工资，原因必填，使用版本并发校验；仅变化的金额记历史。报表、月结与任务支出只汇总有效 Participant 核定工资，不从任务或单司机条目再次累加。</w:t>
+        <w:t>工资台账覆盖 INTERNAL 和 OUTSOURCED，按月、司机、类型、模板、任务及普通/转派筛选；转派任务明显标记并展示所有参与顺序和工资。授权人员在任务上下文批量核定全部参与人工资，原因必填，使用版本并发校验；仅变化的金额记历史。报表、月结与任务支出只汇总有效 Participant 核定工资，不从任务或单司机条目再次累加。工资台账仅在运输任务完成卸货、状态为 COMPLETED 后计入有效 Participant 工资；未卸货任务的预核工资不进入台账、汇总或导出。</w:t>
       </w:r>
     </w:p>
     <w:p>
@@ -226,6 +232,18 @@
       </w:pPr>
       <w:r>
         <w:t>费用申请首先确定不可变 applicationScope：DAILY 或 TASK。DAILY 在同一申请中维护可编辑明细表，支持手工新增多条及导入系统固定 Excel 行后统一修改、删除；Excel 仅辅助填表，最终以提交时确认的明细为准；TASK 只可单笔，先选司机再从其参与任务中选目标。司机与公司车分别真实存在，DAILY 不要求两者当前绑定。外协司机不得申请费用。费用种类不硬编码限定范围；统一字段为日期、公司车、司机、明细、金额、票据号、发票号、备注和站点名称，金额必须大于 0，其余描述字段可空，不设置“是否结清”。</w:t>
+      </w:r>
+      <w:r>
+        <w:t xml:space="preserve"> 日常费用可选填车挂号；固定 Excel、手工明细、审批明细和正式费用均保留填写时的车挂号文本快照，不据此改变司机、车辆或任务校验。</w:t>
+      </w:r>
+      <w:r>
+        <w:t xml:space="preserve"> 可选车挂号须对应当前未删除的车挂资料；仅存在性校验，不要求与公司车辆当前绑定。导入只接受新增车挂号列的固定模板，不保留旧模板兼容。电费和临时电费仅允许能源类型为 ELECTRIC 的公司车辆申请，气费和临时气费仅允许能源类型为 GAS 的公司车辆申请；DAILY 每条明细及 TASK 单笔均按所选车辆校验，打回重新提交时重新校验。</w:t>
+      </w:r>
+      <w:r>
+        <w:t xml:space="preserve"> 定版交互：管理端 DAILY 在同一申请中支持手工多明细与固定 Excel 追加后统一编辑，TASK 单笔；微信小程序 DAILY 和 TASK 每次均只提交一笔，不提供 Excel。双端发起申请和审批节点均可附多张图片，使用统一附件中心；申请图片归属本次提交版本，节点处理图片归属实际 Approval Action。图片选填，审批通过后仍只经统一审批链生成正式费用台账。</w:t>
+      </w:r>
+      <w:r>
+        <w:t xml:space="preserve"> 首次交付的正式费用大类包含过路费（TOLL），不包含搬运费（CARRYING）和洗车费（CAR_WASH）。</w:t>
       </w:r>
     </w:p>
     <w:p>
@@ -272,8 +290,9 @@
       <w:pPr>
         <w:pStyle w:val="ListBullet"/>
       </w:pPr>
+      <w:r/>
       <w:r>
-        <w:t>换胎申请仅由小程序按拍照、OCR、确认胎号、匹配库存、确认申请完成。保存原图、OCR 原始结果及人工确认值，已申领轮胎不可再次申领；审批在审批中心。附件按 owner/purpose 校验访问权限，原始磅单和后续纠错证据分别存储、分别显示。</w:t>
+        <w:t>审批打回申请人后，原申请人在小程序待我处理和我发起的中可查看打回人、时间、原因及原申请，可修改胎号、重传照片并重新识别；整批库存校验通过后，在原审批实例形成新提交版本并重新进入冻结流程，既有审批动作保留。打回指定节点仅交由目标节点处理。换胎申请仅由小程序发起：先选择已发布的换胎流程，再逐张上传照片并读取 OCR 候选；每张照片选择一个候选胎号或手工修改，可继续添加、删除或重新上传照片。一次申请可包含一张或多张照片及对应的不同胎号。提交前对整份列表逐项匹配库存；任一胎号不存在、已申领、正在审批或同批重复时保留草稿并在该项展示具体原因，全部通过后一次提交为一个审批实例。保存每项原图、OCR 原始结果及人工确认值；审批通过时整批原子申领，已申领轮胎不可再次申领；审批在审批中心。附件按 owner/purpose 校验访问权限，原始磅单和后续纠错证据分别存储、分别显示。</w:t>
       </w:r>
     </w:p>
     <w:p>
@@ -282,6 +301,9 @@
       </w:pPr>
       <w:r>
         <w:t>站内通知是事务提交后的辅助提醒，失败记录日志且不回滚核心业务；通知不是审批、运输或工资事实来源。角色范围不得因通知入口放宽。弱网、上传中、失败和重试须明确反馈。</w:t>
+      </w:r>
+      <w:r>
+        <w:t xml:space="preserve"> 审批创建首个待办、流转至下一节点、打回指定节点以及重新提交生成待办时，通知当前节点有权处理的实际账号；打回申请人时通知原申请人。每次任务和打回动作只生成一次站内通知。</w:t>
       </w:r>
     </w:p>
     <w:p>

</xml_diff>

<commit_message>
fix: refine V3 workflows and charging attribution
</commit_message>
<xml_diff>
--- a/docs/01-项目需求规格说明书_V3.0.docx
+++ b/docs/01-项目需求规格说明书_V3.0.docx
@@ -268,6 +268,15 @@
       </w:pPr>
       <w:r>
         <w:t>普通 DAILY 费用 Excel 仅用于审批申请填表，TASK 费用只可单笔审批；不提供通用 EXPENSE 直接导入。当前只有充电公司专项可在人工确认并经服务端复核后直接生成 ExpenseEntry。未来其它第三方费用来源须另行确认正式业务规则，不因存在 Excel 或导入菜单自行开放。充电公司专项导入由管理员维护每家公司唯一当前字段映射，只从系统识别的 Excel 表头列位置选择订单号、车牌、充电时间和金额。前端解析第一工作表，只读预览全部有效订单、异常行、零元数及金额；空行后的订单不得遗漏，汇总行不得入账。操作人员确认前不保存原文件、不生成费用。服务端按原文件复核订单、来源、金额、去重与车辆，保存 ImportBatch、OriginalFile 和 SourceOrder；来源系统＋订单编号类型＋原始订单号唯一。正金额订单生成一条 ExpenseEntry，零元合法订单保留 SourceOrder 及文件行号、参与去重但不入账；金额为空、负数或不可解析阻止提交。有效订单数＝正常入账＋零元不入账＋已存在重复，异常另报。唯一匹配公司车、真实充电时间及实际发车/卸货参与事实时自动归任务；无匹配或多匹配保留未归属，不根据当前绑定、业务日、金额或司机姓名猜测。充电费用仍使用统一 ExpenseEntry 经营与月结口径。</w:t>
+      </w:r>
+      <w:r>
+        <w:t xml:space="preserve"> 新增充电公司只填写公司名称，上传 Excel 样表后选择四字段映射；来源系统标识由服务端生成，为一位大写英文字母加七位数字。订单编号类型为系统内部固定值，不由用户配置。</w:t>
+      </w:r>
+      <w:r>
+        <w:t xml:space="preserve"> 自动归属成功的充电订单记为电费，并记录充电时段对应的任务参与司机；未归属订单记为临时电费，司机留空，不根据当前车辆绑定推断。</w:t>
+      </w:r>
+      <w:r>
+        <w:t xml:space="preserve"> 充电来源费用后续人工归属或解除归属时，费用类型及司机同步按目标任务参与事实更新。</w:t>
       </w:r>
     </w:p>
     <w:p>

</xml_diff>